<commit_message>
Write section 3 as a real task analysis, criterion included
</commit_message>
<xml_diff>
--- a/כשכש-נשנש - מסמך הגשה.docx
+++ b/כשכש-נשנש - מסמך הגשה.docx
@@ -1317,7 +1317,7 @@
           <w:szCs w:val="32"/>
           <w:rtl/>
         </w:rPr>
-        <w:t xml:space="preserve">3.  איך המשחק משיג את המטרות — ניתוח לפי מאמ"י</w:t>
+        <w:t xml:space="preserve">3.  איך המשחק משיג את המטרות — ניתוח משימה לפי מאמ"י</w:t>
       </w:r>
     </w:p>
     <w:p>
@@ -1333,7 +1333,23 @@
           <w:szCs w:val="24"/>
           <w:rtl/>
         </w:rPr>
-        <w:t xml:space="preserve">הניתוח נערך לפי המבנה שהוגדר על ידי המנחה: מטלה, אסטרטגיה, מנגנונים, ידע. מתחילים מהמטלה הפדגוגית; מזהים את האסטרטגיה, שהיא רצף הפעולות שבוצעו בפועל; ומפרקים אותה לשניים — הידע שהיא דורשת והמנגנונים הקוגניטיביים שהיא מפעילה.</w:t>
+        <w:t xml:space="preserve">מאמ"י הוא כלי לניתוח תפקודים אקדמיים: מטלה, אסטרטגיה, מנגנונים, ידע. הניתוח מתחיל מהמטלה הפדגוגית; מזהה את האסטרטגיה, שהיא בהגדרתה "רצף הפעולות שבוצעו בפועל" — כלומר מה הילד עושה ולא מה הוא אמור לעשות; ומפרק אותה לשניים: הידע הספציפי שהיא דורשת, והמנגנונים הקוגניטיביים שהיא מפעילה. בהקשר של בניית שיטת לימוד נוסף רכיב חמישי, קריטריון — עד מתי ללמוד.</w:t>
+      </w:r>
+    </w:p>
+    <w:p>
+      <w:pPr>
+        <w:bidi/>
+        <w:spacing w:after="140" w:line="340"/>
+        <w:jc w:val="right"/>
+      </w:pPr>
+      <w:r>
+        <w:rPr>
+          <w:rFonts w:ascii="David" w:cs="David" w:eastAsia="David" w:hAnsi="David"/>
+          <w:sz w:val="24"/>
+          <w:szCs w:val="24"/>
+          <w:rtl/>
+        </w:rPr>
+        <w:t xml:space="preserve">להלן ניתוח כזה על המשחק.</w:t>
       </w:r>
     </w:p>
     <w:p>
@@ -2591,7 +2607,7 @@
           <w:szCs w:val="26"/>
           <w:rtl/>
         </w:rPr>
-        <w:t xml:space="preserve">הדלת הכחולה: שני כללים שונים, לא גודל</w:t>
+        <w:t xml:space="preserve">הדלת הכחולה: הבדל במנגנון, לא בידע</w:t>
       </w:r>
     </w:p>
     <w:p>
@@ -2607,7 +2623,7 @@
           <w:szCs w:val="24"/>
           <w:rtl/>
         </w:rPr>
-        <w:t xml:space="preserve">הדלת הקלה מקבצת שתי משפחות שקל להפעיל עליהן כלל במקום לשלוף מהזיכרון — אבל הכלל אינו זהה בשתיהן, וכדאי להפריד:</w:t>
+        <w:t xml:space="preserve">הדלת הקלה מקבצת שתי משפחות שאפשר להפעיל עליהן כלל במקום לשלוף מהזיכרון. בשפת מאמ"י ההבחנה ביניהן אינה בידע אלא במנגנון — שתיהן דורשות אותו תוכן, עובדת כפל, אבל מפעילות תהליך קוגניטיבי שונה:</w:t>
       </w:r>
     </w:p>
     <w:p>
@@ -2628,7 +2644,7 @@
           <w:szCs w:val="24"/>
           <w:rtl/>
         </w:rPr>
-        <w:t xml:space="preserve">כפל ב-2 הוא הכפלה, פעולה חיבורית שהילד כבר שולט בה לפני שהוא לומד כפל.</w:t>
+        <w:t xml:space="preserve">כפל ב-2 מופעל דרך הכפלה — פעולה חיבורית שהילד שולט בה עוד לפני שלמד כפל.</w:t>
       </w:r>
     </w:p>
     <w:p>
@@ -2649,7 +2665,7 @@
           <w:szCs w:val="24"/>
           <w:rtl/>
         </w:rPr>
-        <w:t xml:space="preserve">כפל ב-10 הוא כלל ייצוג בבסיס עשר — הוספת ספרת אפס. הוא אינו נשען על חשבון כלל.</w:t>
+        <w:t xml:space="preserve">כפל ב-10 מופעל דרך כלל ייצוג בבסיס עשר, הוספת ספרת אפס. הוא אינו נשען על חשבון כלל.</w:t>
       </w:r>
     </w:p>
     <w:p>
@@ -2665,7 +2681,7 @@
           <w:szCs w:val="24"/>
           <w:rtl/>
         </w:rPr>
-        <w:t xml:space="preserve">ההבחנה חשובה כי היא מדגימה בדיוק את הטענה שגודל אינו מנבא מספיק: 9×10 = 90 היא מכפלה גדולה ומהעובדות הקלות בלוח, ואילו 6×7 = 42 היא מכפלה קטנה יותר ומהקשות שבו. באותה שקופית שבה המנחה ממחיש את אפקט גודל הבעיה ("למשל במתמטיקה, 2×3 קל יותר מ-8×7") הוא מדגים את ההשפעה של הגודל; הדלת הכחולה מבוססת על מנגנון אחר, של גזירוּת מכלל.</w:t>
+        <w:t xml:space="preserve">ההבחנה אינה סמנטית. היא מדגימה בדיוק את הטענה שגודל המכפלה אינו מנבא מספיק: 9×10 = 90 היא מכפלה גדולה ומהעובדות הקלות בלוח, ואילו 6×7 = 42 קטנה ממנה ומהקשות שבו. אותה עובדה גדולה קלה משום שהמנגנון שמפעילים עליה אינו שליפה.</w:t>
       </w:r>
     </w:p>
     <w:tbl>
@@ -3146,7 +3162,176 @@
           <w:szCs w:val="26"/>
           <w:rtl/>
         </w:rPr>
-        <w:t xml:space="preserve">קריטריון — מה נמדד ומה אינו מדיד</w:t>
+        <w:t xml:space="preserve">קריטריון — עד מתי ללמוד</w:t>
+      </w:r>
+    </w:p>
+    <w:p>
+      <w:pPr>
+        <w:bidi/>
+        <w:spacing w:after="140" w:line="340"/>
+        <w:jc w:val="right"/>
+      </w:pPr>
+      <w:r>
+        <w:rPr>
+          <w:rFonts w:ascii="David" w:cs="David" w:eastAsia="David" w:hAnsi="David"/>
+          <w:sz w:val="24"/>
+          <w:szCs w:val="24"/>
+          <w:rtl/>
+        </w:rPr>
+        <w:t xml:space="preserve">הקריטריון במשחק אינו מוגדר ברמת הרמה או ברמת המפגש, אלא ברמת העובדה הבודדת. כל עובדה שהילד טעה בה נכנסת לרשימת חזרה אישית במשקל 2. טעות נוספת מעלה את המשקל בעוד אחד, עד תקרה של 5; תשובה נכונה מורידה אותו באחד; וכשהמשקל מגיע לאפס העובדה נגרעת מהרשימה ומפסיקה לחזור. בין לבין, ככל שמשקלה של עובדה גבוה יותר כך היא נשלפת לתרגול בתדירות גבוהה יותר.</w:t>
+      </w:r>
+    </w:p>
+    <w:p>
+      <w:pPr>
+        <w:bidi/>
+        <w:spacing w:after="140" w:line="340"/>
+        <w:jc w:val="right"/>
+      </w:pPr>
+      <w:r>
+        <w:rPr>
+          <w:rFonts w:ascii="David" w:cs="David" w:eastAsia="David" w:hAnsi="David"/>
+          <w:sz w:val="24"/>
+          <w:szCs w:val="24"/>
+          <w:rtl/>
+        </w:rPr>
+        <w:t xml:space="preserve">במילים אחרות: עובדה נחשבת נלמדת כשהילד ענה עליה נכון פעמיים יותר מאשר טעה בה. הרשימה נשמרת בין מפגשים, כך שהקריטריון נמדד לאורך זמן ולא בתוך מפגש בודד. מנגנון זה פעיל בכל ארבעת מצבי ההפעלה המהירה.</w:t>
+      </w:r>
+    </w:p>
+    <w:p>
+      <w:pPr>
+        <w:bidi/>
+        <w:spacing w:after="140" w:line="340"/>
+        <w:jc w:val="right"/>
+      </w:pPr>
+      <w:r>
+        <w:rPr>
+          <w:rFonts w:ascii="David" w:cs="David" w:eastAsia="David" w:hAnsi="David"/>
+          <w:sz w:val="24"/>
+          <w:szCs w:val="24"/>
+          <w:rtl/>
+        </w:rPr>
+        <w:t xml:space="preserve">שילוב זה של חזרה מרווחת על פריטים שנכשלו עולה בקנה אחד עם שני ממצאים: תרומתה הייחודית של השליפה ללמידה (Karpicke ו-Roediger, 2008) ועדיפותו של תרגול מפוזר על מרוכז (Cepeda ואחרים, 2006).</w:t>
+      </w:r>
+    </w:p>
+    <w:tbl>
+      <w:tblPr>
+        <w:bidiVisual/>
+        <w:tblW w:type="dxa" w:w="9000"/>
+        <w:tblBorders>
+          <w:top w:val="single" w:color="auto" w:sz="4"/>
+          <w:left w:val="single" w:color="auto" w:sz="4"/>
+          <w:bottom w:val="single" w:color="auto" w:sz="4"/>
+          <w:right w:val="single" w:color="auto" w:sz="4"/>
+          <w:insideH w:val="single" w:color="auto" w:sz="4"/>
+          <w:insideV w:val="single" w:color="auto" w:sz="4"/>
+        </w:tblBorders>
+      </w:tblPr>
+      <w:tblGrid>
+        <w:gridCol w:w="9000"/>
+      </w:tblGrid>
+      <w:tr>
+        <w:tc>
+          <w:tcPr>
+            <w:tcW w:type="dxa" w:w="9000"/>
+            <w:shd w:fill="FFF2CC" w:val="clear"/>
+            <w:tcMar>
+              <w:top w:type="dxa" w:w="140"/>
+              <w:left w:type="dxa" w:w="160"/>
+              <w:bottom w:type="dxa" w:w="140"/>
+              <w:right w:type="dxa" w:w="160"/>
+            </w:tcMar>
+          </w:tcPr>
+          <w:p>
+            <w:pPr>
+              <w:bidi/>
+              <w:spacing w:after="80" w:line="320"/>
+              <w:jc w:val="right"/>
+            </w:pPr>
+            <w:r>
+              <w:rPr>
+                <w:rFonts w:ascii="David" w:cs="David" w:eastAsia="David" w:hAnsi="David"/>
+                <w:b/>
+                <w:bCs/>
+                <w:sz w:val="22"/>
+                <w:szCs w:val="22"/>
+                <w:rtl/>
+              </w:rPr>
+              <w:t xml:space="preserve">מגבלה שיש להצהיר עליה</w:t>
+            </w:r>
+          </w:p>
+          <w:p>
+            <w:pPr>
+              <w:bidi/>
+              <w:spacing w:after="80" w:line="320"/>
+              <w:jc w:val="right"/>
+            </w:pPr>
+            <w:r>
+              <w:rPr>
+                <w:rFonts w:ascii="David" w:cs="David" w:eastAsia="David" w:hAnsi="David"/>
+                <w:b w:val="false"/>
+                <w:bCs w:val="false"/>
+                <w:sz w:val="22"/>
+                <w:szCs w:val="22"/>
+                <w:rtl/>
+              </w:rPr>
+              <w:t xml:space="preserve">הקריטריון נשען על דיוק בלבד. המשחק מודד זמן תגובה לכל פריט, אך אינו משתמש בו כדי להחליט אם עובדה נלמדה — ולכן ילד ששולף נכון אך באיטיות ייחשב כמי שסיים ללמוד אותה. במטרה שהיא שטף שליפה, זהו פער בין מה שנמדד לבין מה שמכריע. הוא ניתן לתיקון, אך שינוי כזה משנה את הגדרת "ידיעה" בהתערבות ואינו החלטה טכנית.</w:t>
+            </w:r>
+          </w:p>
+          <w:p>
+            <w:pPr>
+              <w:bidi/>
+              <w:spacing w:after="80" w:line="320"/>
+              <w:jc w:val="right"/>
+            </w:pPr>
+            <w:r>
+              <w:rPr>
+                <w:rFonts w:ascii="David" w:cs="David" w:eastAsia="David" w:hAnsi="David"/>
+                <w:b w:val="false"/>
+                <w:bCs w:val="false"/>
+                <w:sz w:val="22"/>
+                <w:szCs w:val="22"/>
+                <w:rtl/>
+              </w:rPr>
+              <w:t xml:space="preserve">בנוסף: הרשימה מזוהה לפי שם השחקן במכשיר, ולכן שני ילדים בעלי אותו שם באותו מכשיר חולקים רשימה, וילד שעובר מכשיר מתחיל מחדש.</w:t>
+            </w:r>
+          </w:p>
+        </w:tc>
+      </w:tr>
+    </w:tbl>
+    <w:p>
+      <w:pPr>
+        <w:bidi/>
+        <w:spacing w:after="120"/>
+        <w:jc w:val="right"/>
+      </w:pPr>
+      <w:r>
+        <w:rPr>
+          <w:rFonts w:ascii="David" w:cs="David" w:eastAsia="David" w:hAnsi="David"/>
+          <w:sz w:val="24"/>
+          <w:szCs w:val="24"/>
+          <w:rtl/>
+        </w:rPr>
+        <w:t xml:space="preserve"/>
+      </w:r>
+    </w:p>
+    <w:p>
+      <w:pPr>
+        <w:pStyle w:val="Heading2"/>
+        <w:bidi/>
+        <w:spacing w:after="120" w:before="260"/>
+        <w:jc w:val="right"/>
+      </w:pPr>
+      <w:r>
+        <w:rPr>
+          <w:rFonts w:ascii="David" w:cs="David" w:eastAsia="David" w:hAnsi="David"/>
+          <w:b/>
+          <w:bCs/>
+          <w:color w:val="2E5496"/>
+          <w:sz w:val="26"/>
+          <w:szCs w:val="26"/>
+          <w:rtl/>
+        </w:rPr>
+        <w:t xml:space="preserve">מה נמדד ומה אינו ניתן למדידה</w:t>
       </w:r>
     </w:p>
     <w:p>

</xml_diff>

<commit_message>
Correct the interference measurement: the earlier figures were wrong
The published 57.8% to 1.2% came from a simulation that left out three of
the guards the real code applies, the important one being the rule that
stops two answers ending in zero landing in the same turn. Replaying
rollDoor with every guard in place gives 57.1% to 6.3% at the purple door
and 68.5% to 57.0% at Beginner.

The reason Beginner barely moves is worth more than the number. With only
the blue door in play, that zero rule blocks every remaining times-ten
fact as soon as one has appeared, leaving almost nothing but times-two
facts, all sharing the operand 2. So the preference has no room exactly
where interference is highest to begin with. Closing that needs a change
to the zero rule, which is a change to the rules of play and is not made
here.
</commit_message>
<xml_diff>
--- a/כשכש-נשנש - מסמך הגשה.docx
+++ b/כשכש-נשנש - מסמך הגשה.docx
@@ -2869,7 +2869,7 @@
                 <w:szCs w:val="22"/>
                 <w:rtl/>
               </w:rPr>
-              <w:t xml:space="preserve"/>
+              <w:t xml:space="preserve">דלת</w:t>
             </w:r>
           </w:p>
         </w:tc>
@@ -2899,7 +2899,7 @@
                 <w:szCs w:val="22"/>
                 <w:rtl/>
               </w:rPr>
-              <w:t xml:space="preserve">לפני</w:t>
+              <w:t xml:space="preserve">בלי ההעדפה</w:t>
             </w:r>
           </w:p>
         </w:tc>
@@ -2929,7 +2929,7 @@
                 <w:szCs w:val="22"/>
                 <w:rtl/>
               </w:rPr>
-              <w:t xml:space="preserve">אחרי</w:t>
+              <w:t xml:space="preserve">עם ההעדפה</w:t>
             </w:r>
           </w:p>
         </w:tc>
@@ -2960,7 +2960,7 @@
                 <w:szCs w:val="22"/>
                 <w:rtl/>
               </w:rPr>
-              <w:t xml:space="preserve">רמת מתחילים (דלת אחת)</w:t>
+              <w:t xml:space="preserve">סגולה</w:t>
             </w:r>
           </w:p>
         </w:tc>
@@ -2989,7 +2989,7 @@
                 <w:szCs w:val="22"/>
                 <w:rtl/>
               </w:rPr>
-              <w:t xml:space="preserve">57.8%</w:t>
+              <w:t xml:space="preserve">57.1%</w:t>
             </w:r>
           </w:p>
         </w:tc>
@@ -3018,7 +3018,7 @@
                 <w:szCs w:val="22"/>
                 <w:rtl/>
               </w:rPr>
-              <w:t xml:space="preserve">1.2%</w:t>
+              <w:t xml:space="preserve">6.3%</w:t>
             </w:r>
           </w:p>
         </w:tc>
@@ -3049,7 +3049,7 @@
                 <w:szCs w:val="22"/>
                 <w:rtl/>
               </w:rPr>
-              <w:t xml:space="preserve">דלת סגולה</w:t>
+              <w:t xml:space="preserve">כחולה, ברמה שהיא הדלת היחידה בה</w:t>
             </w:r>
           </w:p>
         </w:tc>
@@ -3078,7 +3078,7 @@
                 <w:szCs w:val="22"/>
                 <w:rtl/>
               </w:rPr>
-              <w:t xml:space="preserve">63.8%</w:t>
+              <w:t xml:space="preserve">68.5%</w:t>
             </w:r>
           </w:p>
         </w:tc>
@@ -3107,7 +3107,7 @@
                 <w:szCs w:val="22"/>
                 <w:rtl/>
               </w:rPr>
-              <w:t xml:space="preserve">0.6%</w:t>
+              <w:t xml:space="preserve">57.0%</w:t>
             </w:r>
           </w:p>
         </w:tc>
@@ -3126,9 +3126,110 @@
           <w:szCs w:val="24"/>
           <w:rtl/>
         </w:rPr>
-        <w:t xml:space="preserve">שיעור זוגות התרגילים העוקבים החולקים ספרה, בסימולציה של 4,000 תורות. ההעדפה אינה כלל מוחלט: במשפחה בת דלת אחת לא תמיד קיים זוג חסר חפיפה, ואכיפה מלאה הייתה עוצרת את התור.</w:t>
-      </w:r>
-    </w:p>
+        <w:t xml:space="preserve">שיעור זוגות התרגילים העוקבים שחולקים אופרנד, בסימולציה של 4,000 תורים במסלול בן ארבעה צעדים, המשחזרת את כל כללי בחירת התרגיל שבמשחק.</w:t>
+      </w:r>
+    </w:p>
+    <w:p>
+      <w:pPr>
+        <w:bidi/>
+        <w:spacing w:after="120"/>
+        <w:jc w:val="right"/>
+      </w:pPr>
+      <w:r>
+        <w:rPr>
+          <w:rFonts w:ascii="David" w:cs="David" w:eastAsia="David" w:hAnsi="David"/>
+          <w:sz w:val="24"/>
+          <w:szCs w:val="24"/>
+          <w:rtl/>
+        </w:rPr>
+        <w:t xml:space="preserve"/>
+      </w:r>
+    </w:p>
+    <w:tbl>
+      <w:tblPr>
+        <w:bidiVisual/>
+        <w:tblW w:type="dxa" w:w="9000"/>
+        <w:tblBorders>
+          <w:top w:val="single" w:color="auto" w:sz="4"/>
+          <w:left w:val="single" w:color="auto" w:sz="4"/>
+          <w:bottom w:val="single" w:color="auto" w:sz="4"/>
+          <w:right w:val="single" w:color="auto" w:sz="4"/>
+          <w:insideH w:val="single" w:color="auto" w:sz="4"/>
+          <w:insideV w:val="single" w:color="auto" w:sz="4"/>
+        </w:tblBorders>
+      </w:tblPr>
+      <w:tblGrid>
+        <w:gridCol w:w="9000"/>
+      </w:tblGrid>
+      <w:tr>
+        <w:tc>
+          <w:tcPr>
+            <w:tcW w:type="dxa" w:w="9000"/>
+            <w:shd w:fill="FFF2CC" w:val="clear"/>
+            <w:tcMar>
+              <w:top w:type="dxa" w:w="140"/>
+              <w:left w:type="dxa" w:w="160"/>
+              <w:bottom w:type="dxa" w:w="140"/>
+              <w:right w:type="dxa" w:w="160"/>
+            </w:tcMar>
+          </w:tcPr>
+          <w:p>
+            <w:pPr>
+              <w:bidi/>
+              <w:spacing w:after="80" w:line="320"/>
+              <w:jc w:val="right"/>
+            </w:pPr>
+            <w:r>
+              <w:rPr>
+                <w:rFonts w:ascii="David" w:cs="David" w:eastAsia="David" w:hAnsi="David"/>
+                <w:b/>
+                <w:bCs/>
+                <w:sz w:val="22"/>
+                <w:szCs w:val="22"/>
+                <w:rtl/>
+              </w:rPr>
+              <w:t xml:space="preserve">ההעדפה עובדת ברמות מרובות-דלתות וכמעט אינה עובדת ברמת המתחילים. זה ממצא, לא תקלה.</w:t>
+            </w:r>
+          </w:p>
+          <w:p>
+            <w:pPr>
+              <w:bidi/>
+              <w:spacing w:after="80" w:line="320"/>
+              <w:jc w:val="right"/>
+            </w:pPr>
+            <w:r>
+              <w:rPr>
+                <w:rFonts w:ascii="David" w:cs="David" w:eastAsia="David" w:hAnsi="David"/>
+                <w:b w:val="false"/>
+                <w:bCs w:val="false"/>
+                <w:sz w:val="22"/>
+                <w:szCs w:val="22"/>
+                <w:rtl/>
+              </w:rPr>
+              <w:t xml:space="preserve">כלל אחר במשחק מונע שתי תשובות המסתיימות באפס באותו תור. ברמת המתחילים, שבה פעילה רק הדלת הכחולה, הכלל חוסם את כל עובדות הכפל בעשר לאחר שהופיעה אחת מהן, ומשאיר כמעט רק עובדות כפל בשתיים — שכולן חולקות את האופרנד 2. כך שדווקא ברמה שבה ההפרעה גבוהה מלכתחילה, אין להעדפה מרחב לפעול.</w:t>
+            </w:r>
+          </w:p>
+          <w:p>
+            <w:pPr>
+              <w:bidi/>
+              <w:spacing w:after="80" w:line="320"/>
+              <w:jc w:val="right"/>
+            </w:pPr>
+            <w:r>
+              <w:rPr>
+                <w:rFonts w:ascii="David" w:cs="David" w:eastAsia="David" w:hAnsi="David"/>
+                <w:b w:val="false"/>
+                <w:bCs w:val="false"/>
+                <w:sz w:val="22"/>
+                <w:szCs w:val="22"/>
+                <w:rtl/>
+              </w:rPr>
+              <w:t xml:space="preserve">לפיכך המענה לממצא של Dotan ו-Zviran-Ginat חלקי: הוא פועל ברמות שבהן פעילות כמה דלתות, ואינו פועל ברמה הראשונה. סגירת הפער דורשת שינוי בכלל האחר, והוא לא נעשה.</w:t>
+            </w:r>
+          </w:p>
+        </w:tc>
+      </w:tr>
+    </w:tbl>
     <w:p>
       <w:pPr>
         <w:bidi/>

</xml_diff>

<commit_message>
State the retirement rule as it actually works, and drop the em dashes
</commit_message>
<xml_diff>
--- a/כשכש-נשנש - מסמך הגשה.docx
+++ b/כשכש-נשנש - מסמך הגשה.docx
@@ -18,7 +18,7 @@
           <w:szCs w:val="44"/>
           <w:rtl/>
         </w:rPr>
-        <w:t xml:space="preserve">כשכש־נשנש  |  Dogylishios</w:t>
+        <w:t xml:space="preserve">כשכש-נשנש  |  Dogylishios</w:t>
       </w:r>
     </w:p>
     <w:p>
@@ -119,7 +119,7 @@
                 <w:szCs w:val="22"/>
                 <w:rtl/>
               </w:rPr>
-              <w:t xml:space="preserve">לדלת הכחולה (כפל ב-2 וב-10) אין ממצא אמפירי ייעודי כפי שקיים לאפקט החמש. הנימוק בסעיף 3 הוא מבני ולא אמפירי, והוא מוצג ככזה. אם יימצא מקור ייעודי — אפשר לחזק. אין להמציא מקור.</w:t>
+              <w:t xml:space="preserve">לדלת הכחולה (כפל ב-2 וב-10) אין ממצא אמפירי ייעודי כפי שקיים לאפקט החמש. הנימוק בסעיף 3 הוא מבני ולא אמפירי, והוא מוצג ככזה. אם יימצא מקור ייעודי, אפשר לחזק. אין להמציא מקור.</w:t>
             </w:r>
           </w:p>
           <w:p>
@@ -419,7 +419,7 @@
           <w:szCs w:val="24"/>
           <w:rtl/>
         </w:rPr>
-        <w:t xml:space="preserve">הלוח בנוי ממשושים ממוספרים. בין כל שני משושים סמוכים עובר קו צבעוני — "דלת". תור מורכב משלושה שלבים:</w:t>
+        <w:t xml:space="preserve">הלוח בנוי ממשושים ממוספרים. בין כל שני משושים סמוכים עובר קו צבעוני שנקרא "דלת". תור מורכב משלושה שלבים:</w:t>
       </w:r>
     </w:p>
     <w:p>
@@ -440,7 +440,7 @@
           <w:szCs w:val="24"/>
           <w:rtl/>
         </w:rPr>
-        <w:t xml:space="preserve">שלב 1 — מציאת היעד: מוצג תרגיל כפל, והשחקן מאתר על הלוח את המשושה שמספרו הוא התשובה.</w:t>
+        <w:t xml:space="preserve">שלב 1 (מציאת היעד): מוצג תרגיל כפל, והשחקן מאתר על הלוח את המשושה שמספרו הוא התשובה.</w:t>
       </w:r>
     </w:p>
     <w:p>
@@ -461,7 +461,7 @@
           <w:szCs w:val="24"/>
           <w:rtl/>
         </w:rPr>
-        <w:t xml:space="preserve">שלב 2 — תכנון המסלול: השחקן בונה דרך מהכלב אל היעד, משושה אחר משושה.</w:t>
+        <w:t xml:space="preserve">שלב 2 (תכנון המסלול): השחקן בונה דרך מהכלב אל היעד, משושה אחר משושה.</w:t>
       </w:r>
     </w:p>
     <w:p>
@@ -482,7 +482,7 @@
           <w:szCs w:val="24"/>
           <w:rtl/>
         </w:rPr>
-        <w:t xml:space="preserve">שלב 3 — ההליכה: בכל צעד נפתחת הדלת שעוברים בה, ומוצג תרגיל נוסף. תשובה נכונה מקדמת את הכלב וצוברת גרגירים.</w:t>
+        <w:t xml:space="preserve">שלב 3 (ההליכה): בכל צעד נפתחת הדלת שעוברים בה, ומוצג תרגיל נוסף. תשובה נכונה מקדמת את הכלב וצוברת גרגירים.</w:t>
       </w:r>
     </w:p>
     <w:p>
@@ -1317,7 +1317,7 @@
           <w:szCs w:val="32"/>
           <w:rtl/>
         </w:rPr>
-        <w:t xml:space="preserve">3.  איך המשחק משיג את המטרות — ניתוח משימה לפי מאמ"י</w:t>
+        <w:t xml:space="preserve">3.  איך המשחק משיג את המטרות: ניתוח מטלה לפי מאמ"י</w:t>
       </w:r>
     </w:p>
     <w:p>
@@ -1333,7 +1333,7 @@
           <w:szCs w:val="24"/>
           <w:rtl/>
         </w:rPr>
-        <w:t xml:space="preserve">מאמ"י הוא כלי לניתוח תפקודים אקדמיים: מטלה, אסטרטגיה, מנגנונים, ידע. הניתוח מתחיל מהמטלה הפדגוגית; מזהה את האסטרטגיה, שהיא בהגדרתה "רצף הפעולות שבוצעו בפועל" — כלומר מה הילד עושה ולא מה הוא אמור לעשות; ומפרק אותה לשניים: הידע הספציפי שהיא דורשת, והמנגנונים הקוגניטיביים שהיא מפעילה. בהקשר של בניית שיטת לימוד נוסף רכיב חמישי, קריטריון — עד מתי ללמוד.</w:t>
+        <w:t xml:space="preserve">מאמ"י הוא כלי לניתוח תפקודים אקדמיים: מטלה, אסטרטגיה, מנגנונים, ידע. הניתוח מתחיל מהמטלה הפדגוגית; מזהה את האסטרטגיה, שהיא בהגדרתה "רצף הפעולות שבוצעו בפועל", כלומר מה הילד עושה ולא מה הוא אמור לעשות; ומפרק אותה לשניים: הידע הספציפי שהיא דורשת, והמנגנונים הקוגניטיביים שהיא מפעילה. בהקשר של בניית שיטת לימוד נוסף רכיב חמישי, קריטריון: עד מתי ללמוד.</w:t>
       </w:r>
     </w:p>
     <w:p>
@@ -1421,7 +1421,7 @@
           <w:szCs w:val="26"/>
           <w:rtl/>
         </w:rPr>
-        <w:t xml:space="preserve">אסטרטגיה — רצף הפעולות בפועל</w:t>
+        <w:t xml:space="preserve">אסטרטגיה, רצף הפעולות בפועל</w:t>
       </w:r>
     </w:p>
     <w:p>
@@ -1890,7 +1890,7 @@
           <w:szCs w:val="26"/>
           <w:rtl/>
         </w:rPr>
-        <w:t xml:space="preserve">ידע — ארגון התוכן</w:t>
+        <w:t xml:space="preserve">ידע, ארגון התוכן</w:t>
       </w:r>
     </w:p>
     <w:p>
@@ -2623,7 +2623,7 @@
           <w:szCs w:val="24"/>
           <w:rtl/>
         </w:rPr>
-        <w:t xml:space="preserve">הדלת הקלה מקבצת שתי משפחות שאפשר להפעיל עליהן כלל במקום לשלוף מהזיכרון. בשפת מאמ"י ההבחנה ביניהן אינה בידע אלא במנגנון — שתיהן דורשות אותו תוכן, עובדת כפל, אבל מפעילות תהליך קוגניטיבי שונה:</w:t>
+        <w:t xml:space="preserve">הדלת הקלה מקבצת שתי משפחות שאפשר להפעיל עליהן כלל במקום לשלוף מהזיכרון. בשפת מאמ"י ההבחנה ביניהן אינה בידע אלא במנגנון, שתיהן דורשות אותו תוכן, עובדת כפל, אבל מפעילות תהליך קוגניטיבי שונה:</w:t>
       </w:r>
     </w:p>
     <w:p>
@@ -2644,7 +2644,7 @@
           <w:szCs w:val="24"/>
           <w:rtl/>
         </w:rPr>
-        <w:t xml:space="preserve">כפל ב-2 מופעל דרך הכפלה — פעולה חיבורית שהילד שולט בה עוד לפני שלמד כפל.</w:t>
+        <w:t xml:space="preserve">כפל ב-2 מופעל דרך הכפלה, פעולה חיבורית שהילד שולט בה עוד לפני שלמד כפל.</w:t>
       </w:r>
     </w:p>
     <w:p>
@@ -2763,7 +2763,7 @@
                 <w:szCs w:val="22"/>
                 <w:rtl/>
               </w:rPr>
-              <w:t xml:space="preserve">עם זאת, לא אותר ממצא אמפירי ייעודי לכפל ב-2 או לכפל ב-10 במעמד דומה. הנימוק כאן הוא מבני — גזירוּת מכלל — ולא אמפירי, והוא מוצג ככזה ולא כמסקנה מהספרות.</w:t>
+              <w:t xml:space="preserve">עם זאת, לא אותר ממצא אמפירי ייעודי לכפל ב-2 או לכפל ב-10 במעמד דומה. הנימוק כאן הוא מבני, גזירוּת מכלל, ולא אמפירי, והוא מוצג ככזה ולא כמסקנה מהספרות.</w:t>
             </w:r>
           </w:p>
         </w:tc>
@@ -2818,7 +2818,7 @@
           <w:szCs w:val="24"/>
           <w:rtl/>
         </w:rPr>
-        <w:t xml:space="preserve">ממצא זה נוגע לרצף שבו נפגשות העובדות, לא לסיווגן לפי קושי. בעיצוב המקורי השניים היו כרוכים: דלת שימשה גם כדרגת תגמול וגם כמשפחת עובדות, ולכן ברמת המתחילים — שבה קיימת דלת אחת — כל תרגילי התור באו מאותה משפחה. השניים הופרדו: מבנה התגמול נותר, ונוסף מנגנון המעדיף בכל צעד עובדה שאינה חולקת ספרה עם קודמתה.</w:t>
+        <w:t xml:space="preserve">ממצא זה נוגע לרצף שבו נפגשות העובדות, לא לסיווגן לפי קושי. בעיצוב המקורי השניים היו כרוכים: דלת שימשה גם כדרגת תגמול וגם כמשפחת עובדות, ולכן ברמת המתחילים, שבה קיימת דלת אחת, כל תרגילי התור באו מאותה משפחה. השניים הופרדו: מבנה התגמול נותר, ונוסף מנגנון המעדיף בכל צעד עובדה שאינה חולקת ספרה עם קודמתה.</w:t>
       </w:r>
     </w:p>
     <w:tbl>
@@ -3206,7 +3206,7 @@
                 <w:szCs w:val="22"/>
                 <w:rtl/>
               </w:rPr>
-              <w:t xml:space="preserve">כלל אחר במשחק מונע שתי תשובות המסתיימות באפס באותו תור. ברמת המתחילים, שבה פעילה רק הדלת הכחולה, הכלל חוסם את כל עובדות הכפל בעשר לאחר שהופיעה אחת מהן, ומשאיר כמעט רק עובדות כפל בשתיים — שכולן חולקות את האופרנד 2. כך שדווקא ברמה שבה ההפרעה גבוהה מלכתחילה, אין להעדפה מרחב לפעול.</w:t>
+              <w:t xml:space="preserve">כלל אחר במשחק מונע שתי תשובות המסתיימות באפס באותו תור. ברמת המתחילים, שבה פעילה רק הדלת הכחולה, הכלל חוסם את כל עובדות הכפל בעשר לאחר שהופיעה אחת מהן, ומשאיר כמעט רק עובדות כפל בשתיים, שכולן חולקות את האופרנד 2. כך שדווקא ברמה שבה ההפרעה גבוהה מלכתחילה, אין להעדפה מרחב לפעול.</w:t>
             </w:r>
           </w:p>
           <w:p>
@@ -3263,7 +3263,7 @@
           <w:szCs w:val="26"/>
           <w:rtl/>
         </w:rPr>
-        <w:t xml:space="preserve">קריטריון — עד מתי ללמוד</w:t>
+        <w:t xml:space="preserve">קריטריון: עד מתי ללמוד</w:t>
       </w:r>
     </w:p>
     <w:p>
@@ -3295,7 +3295,7 @@
           <w:szCs w:val="24"/>
           <w:rtl/>
         </w:rPr>
-        <w:t xml:space="preserve">במילים אחרות: עובדה נחשבת נלמדת כשהילד ענה עליה נכון פעמיים יותר מאשר טעה בה. הרשימה נשמרת בין מפגשים, כך שהקריטריון נמדד לאורך זמן ולא בתוך מפגש בודד. מנגנון זה פעיל בכל ארבעת מצבי ההפעלה המהירה.</w:t>
+        <w:t xml:space="preserve">במילים אחרות: עובדה יוצאת מהתרגול כשמספר התשובות הנכונות והמהירות עליה מאזן את המשקל שהצטבר מטעויותיה. מכיוון שהמשקל עולה באחד לכל טעות ונעצר בחמש, נדרשת בפועל תשובה נכונה אחת יותר ממספר הטעויות, עד חמש. הרשימה נשמרת בין מפגשים, כך שהקריטריון נמדד לאורך זמן ולא בתוך מפגש בודד.</w:t>
       </w:r>
     </w:p>
     <w:p>
@@ -3375,7 +3375,7 @@
                 <w:szCs w:val="22"/>
                 <w:rtl/>
               </w:rPr>
-              <w:t xml:space="preserve">הקריטריון נשען על דיוק בלבד. המשחק מודד זמן תגובה לכל פריט, אך אינו משתמש בו כדי להחליט אם עובדה נלמדה — ולכן ילד ששולף נכון אך באיטיות ייחשב כמי שסיים ללמוד אותה. במטרה שהיא שטף שליפה, זהו פער בין מה שנמדד לבין מה שמכריע. הוא ניתן לתיקון, אך שינוי כזה משנה את הגדרת "ידיעה" בהתערבות ואינו החלטה טכנית.</w:t>
+              <w:t xml:space="preserve">הקריטריון נשען על דיוק בלבד. המשחק מודד זמן תגובה לכל פריט, אך אינו משתמש בו כדי להחליט אם עובדה נלמדה, ולכן ילד ששולף נכון אך באיטיות ייחשב כמי שסיים ללמוד אותה. במטרה שהיא שטף שליפה, זהו פער בין מה שנמדד לבין מה שמכריע. הוא ניתן לתיקון, אך שינוי כזה משנה את הגדרת "ידיעה" בהתערבות ואינו החלטה טכנית.</w:t>
             </w:r>
           </w:p>
           <w:p>
@@ -3893,7 +3893,7 @@
           <w:szCs w:val="24"/>
           <w:rtl/>
         </w:rPr>
-        <w:t xml:space="preserve">תאוריות למידה כלליות מעבר לעומס הקוגניטיבי — לא הכריעו כאן שום החלטה, והכנסתן הייתה מוסיפה נפח ולא ביסוס.</w:t>
+        <w:t xml:space="preserve">תאוריות למידה כלליות מעבר לעומס הקוגניטיבי, לא הכריעו כאן שום החלטה, והכנסתן הייתה מוסיפה נפח ולא ביסוס.</w:t>
       </w:r>
     </w:p>
     <w:p>
@@ -3914,7 +3914,7 @@
           <w:szCs w:val="24"/>
           <w:rtl/>
         </w:rPr>
-        <w:t xml:space="preserve">טענה שמדידת זמן במשחק מזיקה — לא נמצאה לה ראיה. הספרות עוסקת בחרדת מתמטיקה ובזיכרון עבודה, לא בתזמון במשחק. כיבוי השעון מנומק בדרישת תקן הנגישות ובמנגנון שתיארו Ramirez ואחרים (2013), ולא בראיה ישירה.</w:t>
+        <w:t xml:space="preserve">טענה שמדידת זמן במשחק מזיקה, לא נמצאה לה ראיה. הספרות עוסקת בחרדת מתמטיקה ובזיכרון עבודה, לא בתזמון במשחק. כיבוי השעון מנומק בדרישת תקן הנגישות ובמנגנון שתיארו Ramirez ואחרים (2013), ולא בראיה ישירה.</w:t>
       </w:r>
     </w:p>
     <w:p>
@@ -3935,7 +3935,7 @@
           <w:szCs w:val="24"/>
           <w:rtl/>
         </w:rPr>
-        <w:t xml:space="preserve">טענה שמשוב מיידי מועיל תמיד — Kluger ו-DeNisi (1996) מצאו שהשפעת התערבויות משוב אינה חיובית באופן אחיד, וחלקן פגעו בביצוע.</w:t>
+        <w:t xml:space="preserve">טענה שמשוב מיידי מועיל תמיד, Kluger ו-DeNisi (1996) מצאו שהשפעת התערבויות משוב אינה חיובית באופן אחיד, וחלקן פגעו בביצוע.</w:t>
       </w:r>
     </w:p>
     <w:p>
@@ -3987,7 +3987,7 @@
           <w:szCs w:val="24"/>
           <w:rtl/>
         </w:rPr>
-        <w:t xml:space="preserve">דותן מונה שלושה מרכיבים של משחק טוב: אתגר, חוויה רגשית וחוויה חברתית. שני הראשונים טופלו במפורש. המרכיב החברתי קיים במשחק — יש מצב רב-משתתפים ומצב שיתופי — אך לא תוכנן מתוך המסגרת הזו ולא נבדק. זהו פער אמיתי, והוא מוצהר ולא מטושטש.</w:t>
+        <w:t xml:space="preserve">דותן מונה שלושה מרכיבים של משחק טוב: אתגר, חוויה רגשית וחוויה חברתית. שני הראשונים טופלו במפורש. המרכיב החברתי קיים במשחק, יש מצב רב-משתתפים ומצב שיתופי, אך לא תוכנן מתוך המסגרת הזו ולא נבדק. זהו פער אמיתי, והוא מוצהר ולא מטושטש.</w:t>
       </w:r>
     </w:p>
     <w:p>
@@ -4039,7 +4039,7 @@
           <w:szCs w:val="24"/>
           <w:rtl/>
         </w:rPr>
-        <w:t xml:space="preserve">זיהוי הדלתות נשען בתחילה על צבע בלבד. בשכיחות עיוורון צבעים אדום-ירוק של כ-8% בגברים (Birch, 2012), פירוש הדבר שילד אחד או שניים בכיתה אינם מבחינים בין הדלת ששווה גרגיר לזו ששווה שניים — כלומר המנגנון האסטרטגי כולו אינו זמין להם. בסימולציה של עיוורון צבעים ארבעת צבעי הדלתות התמזגו לשניים.</w:t>
+        <w:t xml:space="preserve">זיהוי הדלתות נשען בתחילה על צבע בלבד. בשכיחות עיוורון צבעים אדום-ירוק של כ-8% בגברים (Birch, 2012), פירוש הדבר שילד אחד או שניים בכיתה אינם מבחינים בין הדלת ששווה גרגיר לזו ששווה שניים, כלומר המנגנון האסטרטגי כולו אינו זמין להם. בסימולציה של עיוורון צבעים ארבעת צבעי הדלתות התמזגו לשניים.</w:t>
       </w:r>
     </w:p>
     <w:p>

</xml_diff>